<commit_message>
changed tool path to tools/dbmigrate/iteration1
</commit_message>
<xml_diff>
--- a/docs/dbmigrate/iteration1/MigrationVerificationReport1.docx
+++ b/docs/dbmigrate/iteration1/MigrationVerificationReport1.docx
@@ -94,7 +94,7 @@
         <w:spacing w:after="40"/>
       </w:pPr>
       <w:r>
-        <w:t xml:space="preserve">Run date (UTC): 2026-09-21 18:53:48</w:t>
+        <w:t xml:space="preserve">Run date (UTC): 2026-09-21 19:27:55</w:t>
       </w:r>
     </w:p>
     <w:p>
@@ -118,7 +118,7 @@
         <w:spacing w:after="240"/>
       </w:pPr>
       <w:r>
-        <w:t xml:space="preserve">Tooling version: git commit ed3df19</w:t>
+        <w:t xml:space="preserve">Tooling version: git commit bbc6fcd</w:t>
       </w:r>
     </w:p>
     <w:p>
@@ -4559,7 +4559,7 @@
               <w:pStyle w:val="TableText"/>
             </w:pPr>
             <w:r>
-              <w:t xml:space="preserve">ed3df19</w:t>
+              <w:t xml:space="preserve">bbc6fcd</w:t>
             </w:r>
           </w:p>
         </w:tc>
@@ -4658,7 +4658,7 @@
               <w:pStyle w:val="TableText"/>
             </w:pPr>
             <w:r>
-              <w:t xml:space="preserve">2026-09-21 18:53:48</w:t>
+              <w:t xml:space="preserve">2026-09-21 19:27:55</w:t>
             </w:r>
           </w:p>
         </w:tc>
@@ -5818,7 +5818,7 @@
       <w:jc w:val="center"/>
     </w:pPr>
     <w:r>
-      <w:t xml:space="preserve">Commit ed3df19 | 2026-09-21 18:53:48 UTC   |   Page </w:t>
+      <w:t xml:space="preserve">Commit bbc6fcd | 2026-09-21 19:27:55 UTC   |   Page </w:t>
     </w:r>
     <w:r>
       <w:fldChar w:fldCharType="begin"/>
@@ -6019,6 +6019,21 @@
       <w:spacing w:after="60"/>
     </w:pPr>
   </w:style>
+  <w:style w:type="paragraph" w:styleId="Code">
+    <w:name w:val="Code"/>
+    <w:basedOn w:val="Normal"/>
+    <w:qFormat/>
+    <w:pPr>
+      <w:shd w:val="clear" w:color="auto" w:fill="F3F4F6"/>
+      <w:spacing w:before="0" w:after="0" w:line="240" w:lineRule="auto"/>
+      <w:ind w:left="200"/>
+    </w:pPr>
+    <w:rPr>
+      <w:rFonts w:ascii="Consolas" w:hAnsi="Consolas" w:cs="Consolas"/>
+      <w:sz w:val="18"/>
+      <w:szCs w:val="18"/>
+    </w:rPr>
+  </w:style>
   <w:style w:type="paragraph" w:styleId="Header">
     <w:name w:val="header"/>
     <w:basedOn w:val="Normal"/>

</xml_diff>

<commit_message>
iteration1 with dedicated directory paths for iteration1
</commit_message>
<xml_diff>
--- a/docs/dbmigrate/iteration1/MigrationVerificationReport1.docx
+++ b/docs/dbmigrate/iteration1/MigrationVerificationReport1.docx
@@ -94,7 +94,7 @@
         <w:spacing w:after="40"/>
       </w:pPr>
       <w:r>
-        <w:t xml:space="preserve">Run date (UTC): 2026-09-21 19:27:55</w:t>
+        <w:t xml:space="preserve">Run date (UTC): 2026-09-21 21:50:38</w:t>
       </w:r>
     </w:p>
     <w:p>
@@ -118,7 +118,7 @@
         <w:spacing w:after="240"/>
       </w:pPr>
       <w:r>
-        <w:t xml:space="preserve">Tooling version: git commit bbc6fcd</w:t>
+        <w:t xml:space="preserve">Tooling version: git commit a93612b</w:t>
       </w:r>
     </w:p>
     <w:p>
@@ -4559,7 +4559,7 @@
               <w:pStyle w:val="TableText"/>
             </w:pPr>
             <w:r>
-              <w:t xml:space="preserve">bbc6fcd</w:t>
+              <w:t xml:space="preserve">a93612b</w:t>
             </w:r>
           </w:p>
         </w:tc>
@@ -4658,7 +4658,7 @@
               <w:pStyle w:val="TableText"/>
             </w:pPr>
             <w:r>
-              <w:t xml:space="preserve">2026-09-21 19:27:55</w:t>
+              <w:t xml:space="preserve">2026-09-21 21:50:38</w:t>
             </w:r>
           </w:p>
         </w:tc>
@@ -5818,7 +5818,7 @@
       <w:jc w:val="center"/>
     </w:pPr>
     <w:r>
-      <w:t xml:space="preserve">Commit bbc6fcd | 2026-09-21 19:27:55 UTC   |   Page </w:t>
+      <w:t xml:space="preserve">Commit a93612b | 2026-09-21 21:50:38 UTC   |   Page </w:t>
     </w:r>
     <w:r>
       <w:fldChar w:fldCharType="begin"/>

</xml_diff>

<commit_message>
reran iteration1 and iteration2 with sanitized data
</commit_message>
<xml_diff>
--- a/docs/dbmigrate/iteration1/MigrationVerificationReport1.docx
+++ b/docs/dbmigrate/iteration1/MigrationVerificationReport1.docx
@@ -78,7 +78,7 @@
                 <w:sz w:val="24"/>
                 <w:szCs w:val="24"/>
               </w:rPr>
-              <w:t xml:space="preserve">41 of 41 checks passed  |  155 of 155 rows verified identical  |  8 tables</w:t>
+              <w:t xml:space="preserve">42 of 42 checks passed  |  155 of 155 rows verified identical  |  8 tables</w:t>
             </w:r>
           </w:p>
         </w:tc>
@@ -94,7 +94,7 @@
         <w:spacing w:after="40"/>
       </w:pPr>
       <w:r>
-        <w:t xml:space="preserve">Run date (UTC): 2026-09-21 21:50:38</w:t>
+        <w:t xml:space="preserve">Run date (UTC): 2026-09-22 17:16:35</w:t>
       </w:r>
     </w:p>
     <w:p>
@@ -118,7 +118,7 @@
         <w:spacing w:after="240"/>
       </w:pPr>
       <w:r>
-        <w:t xml:space="preserve">Tooling version: git commit a93612b</w:t>
+        <w:t xml:space="preserve">Tooling version: git commit 324ddff</w:t>
       </w:r>
     </w:p>
     <w:p>
@@ -586,7 +586,7 @@
               <w:pStyle w:val="TableText"/>
             </w:pPr>
             <w:r>
-              <w:t xml:space="preserve">41</w:t>
+              <w:t xml:space="preserve">42</w:t>
             </w:r>
           </w:p>
         </w:tc>
@@ -600,7 +600,7 @@
               <w:pStyle w:val="TableText"/>
             </w:pPr>
             <w:r>
-              <w:t xml:space="preserve">41</w:t>
+              <w:t xml:space="preserve">42</w:t>
             </w:r>
           </w:p>
         </w:tc>
@@ -734,7 +734,7 @@
         <w:drawing>
           <wp:inline distT="0" distB="0" distL="0" distR="0">
             <wp:extent cx="2300000" cy="1929032"/>
-            <wp:docPr id="1" name="Chart 1" descr="Donut chart: 41 of 41 checks passed"/>
+            <wp:docPr id="1" name="Chart 1" descr="Donut chart: 42 of 42 checks passed"/>
             <wp:cNvGraphicFramePr>
               <a:graphicFrameLocks noChangeAspect="1"/>
             </wp:cNvGraphicFramePr>
@@ -742,7 +742,7 @@
               <a:graphicData uri="http://schemas.openxmlformats.org/drawingml/2006/picture">
                 <pic:pic>
                   <pic:nvPicPr>
-                    <pic:cNvPr id="1" name="image1.png" descr="Donut chart: 41 of 41 checks passed"/>
+                    <pic:cNvPr id="1" name="image1.png" descr="Donut chart: 42 of 42 checks passed"/>
                     <pic:cNvPicPr/>
                   </pic:nvPicPr>
                   <pic:blipFill>
@@ -776,7 +776,7 @@
         <w:rPr>
           <w:i/>
         </w:rPr>
-        <w:t xml:space="preserve">Figure 1. Overall outcome of all 41 checks.</w:t>
+        <w:t xml:space="preserve">Figure 1. Overall outcome of all 42 checks.</w:t>
       </w:r>
     </w:p>
     <w:p>
@@ -1276,7 +1276,7 @@
               <w:pStyle w:val="TableText"/>
             </w:pPr>
             <w:r>
-              <w:t xml:space="preserve">a90ce7a28ea15036</w:t>
+              <w:t xml:space="preserve">a83eada4f190cd73</w:t>
             </w:r>
           </w:p>
         </w:tc>
@@ -2216,7 +2216,7 @@
               <w:pStyle w:val="TableText"/>
             </w:pPr>
             <w:r>
-              <w:t xml:space="preserve">45</w:t>
+              <w:t xml:space="preserve">46</w:t>
             </w:r>
           </w:p>
         </w:tc>
@@ -2230,7 +2230,7 @@
               <w:pStyle w:val="TableText"/>
             </w:pPr>
             <w:r>
-              <w:t xml:space="preserve">45</w:t>
+              <w:t xml:space="preserve">46</w:t>
             </w:r>
           </w:p>
         </w:tc>
@@ -4431,7 +4431,7 @@
         <w:pStyle w:val="ListBullet"/>
       </w:pPr>
       <w:r>
-        <w:t xml:space="preserve">Password hashes and security stamps were copied byte-for-byte. They are compared during verification but never printed in this report. The exported SQL files and the SQLite database therefore contain credential-equivalent data and must be protected accordingly.</w:t>
+        <w:t xml:space="preserve">Every migrated Users row had its password hash and security stamp set to NULL, with a new MustResetPassword column set to 1 - a deliberate one-time-bootstrap policy: forcing a password reset on next login means no usable legacy credential needs to be carried into the target at all. Verification confirms every row is sanitized (section 7) and that every other Users column is unchanged from the source.</w:t>
       </w:r>
     </w:p>
     <w:p>
@@ -4559,7 +4559,7 @@
               <w:pStyle w:val="TableText"/>
             </w:pPr>
             <w:r>
-              <w:t xml:space="preserve">a93612b</w:t>
+              <w:t xml:space="preserve">324ddff</w:t>
             </w:r>
           </w:p>
         </w:tc>
@@ -4658,7 +4658,7 @@
               <w:pStyle w:val="TableText"/>
             </w:pPr>
             <w:r>
-              <w:t xml:space="preserve">2026-09-21 21:50:38</w:t>
+              <w:t xml:space="preserve">2026-09-22 17:16:35</w:t>
             </w:r>
           </w:p>
         </w:tc>
@@ -4691,7 +4691,7 @@
               <w:pStyle w:val="TableText"/>
             </w:pPr>
             <w:r>
-              <w:t xml:space="preserve">f0b3a4bbd89d972f46676ea836a7d8cfd22e7f0cec866ff1762903a89f4a1ab4</w:t>
+              <w:t xml:space="preserve">72d62510dfc78e0be541addc5c2f3d15d26fb586b0d52eb487c4b04d0f67a017</w:t>
             </w:r>
           </w:p>
         </w:tc>
@@ -4710,7 +4710,7 @@
               <w:pStyle w:val="TableText"/>
             </w:pPr>
             <w:r>
-              <w:t xml:space="preserve">02-data.sql SHA-256</w:t>
+              <w:t xml:space="preserve">02-data-sanitized.sql SHA-256</w:t>
             </w:r>
           </w:p>
         </w:tc>
@@ -4724,7 +4724,7 @@
               <w:pStyle w:val="TableText"/>
             </w:pPr>
             <w:r>
-              <w:t xml:space="preserve">d800a8c715e152459e44d67f7f9253c8c42a3fe9c2aa41c51139f1e6c5382a7b</w:t>
+              <w:t xml:space="preserve">4752e8c463068a5d3767f0f8441c2dd39ced67985db960a1e823894b77b17c32</w:t>
             </w:r>
           </w:p>
         </w:tc>
@@ -4790,7 +4790,7 @@
               <w:pStyle w:val="TableText"/>
             </w:pPr>
             <w:r>
-              <w:t xml:space="preserve">9551c1016d98ec62fc0c17868d453624f33855862701502605cbc3964aa4c286</w:t>
+              <w:t xml:space="preserve">1694d96741ed646b1ec89a356ca8c76bd899eb306469968f327147b858213ef6</w:t>
             </w:r>
           </w:p>
         </w:tc>
@@ -5325,9 +5325,9 @@
               <w:pStyle w:val="TableText"/>
             </w:pPr>
             <w:r>
-              <w:t xml:space="preserve">a90ce7a28ea1503640fbe7481dc6caf9</w:t>
+              <w:t xml:space="preserve">a83eada4f190cd7389d15ac7dbb85001</w:t>
               <w:br/>
-              <w:t xml:space="preserve">2f965cfff41bdec5630efd64d2384237</w:t>
+              <w:t xml:space="preserve">ac1fb94653b1069726fcff2367bd3003</w:t>
             </w:r>
           </w:p>
         </w:tc>
@@ -5341,9 +5341,9 @@
               <w:pStyle w:val="TableText"/>
             </w:pPr>
             <w:r>
-              <w:t xml:space="preserve">a90ce7a28ea1503640fbe7481dc6caf9</w:t>
+              <w:t xml:space="preserve">a83eada4f190cd7389d15ac7dbb85001</w:t>
               <w:br/>
-              <w:t xml:space="preserve">2f965cfff41bdec5630efd64d2384237</w:t>
+              <w:t xml:space="preserve">ac1fb94653b1069726fcff2367bd3003</w:t>
             </w:r>
           </w:p>
         </w:tc>
@@ -5818,7 +5818,7 @@
       <w:jc w:val="center"/>
     </w:pPr>
     <w:r>
-      <w:t xml:space="preserve">Commit a93612b | 2026-09-21 21:50:38 UTC   |   Page </w:t>
+      <w:t xml:space="preserve">Commit 324ddff | 2026-09-22 17:16:35 UTC   |   Page </w:t>
     </w:r>
     <w:r>
       <w:fldChar w:fldCharType="begin"/>

</xml_diff>